<commit_message>
fix(edge): headers de seguranca uma vez so na resposta (ZAP 10035 no DAST)
nginx e api mandavam os mesmos headers e o HSTS saia duplicado. a borda
esconde os da api e passa a mandar CORP e Cache-Control no-store.
</commit_message>
<xml_diff>
--- a/docs/Sprint3-Cybersecurity.docx
+++ b/docs/Sprint3-Cybersecurity.docx
@@ -11381,6 +11381,177 @@
     </w:p>
     <w:p>
       <w:pPr>
+        <w:keepNext w:val="false"/>
+        <w:spacing w:after="140" w:before="80" w:line="288"/>
+        <w:jc w:val="left"/>
+      </w:pPr>
+      <w:r>
+        <w:rPr>
+          <w:rFonts w:ascii="Segoe UI" w:cs="Segoe UI" w:eastAsia="Segoe UI" w:hAnsi="Segoe UI"/>
+          <w:b w:val="false"/>
+          <w:bCs w:val="false"/>
+          <w:i w:val="false"/>
+          <w:iCs w:val="false"/>
+          <w:color w:val="3A3A39"/>
+          <w:sz w:val="20"/>
+          <w:szCs w:val="20"/>
+        </w:rPr>
+        <w:t xml:space="preserve">Com a stack subindo no runner (a tag do Mosquitto fixada aqui só existia na máquina local; a oficial é </w:t>
+      </w:r>
+      <w:r>
+        <w:rPr>
+          <w:rFonts w:ascii="Consolas" w:cs="Consolas" w:eastAsia="Consolas" w:hAnsi="Consolas"/>
+          <w:b w:val="false"/>
+          <w:bCs w:val="false"/>
+          <w:color w:val="3C4D7C"/>
+          <w:sz w:val="18"/>
+          <w:szCs w:val="18"/>
+          <w:shd w:fill="EAE6DF" w:val="clear"/>
+        </w:rPr>
+        <w:t xml:space="preserve">2.1.2-alpine</w:t>
+      </w:r>
+      <w:r>
+        <w:rPr>
+          <w:rFonts w:ascii="Segoe UI" w:cs="Segoe UI" w:eastAsia="Segoe UI" w:hAnsi="Segoe UI"/>
+          <w:b w:val="false"/>
+          <w:bCs w:val="false"/>
+          <w:i w:val="false"/>
+          <w:iCs w:val="false"/>
+          <w:color w:val="3A3A39"/>
+          <w:sz w:val="20"/>
+          <w:szCs w:val="20"/>
+        </w:rPr>
+        <w:t xml:space="preserve">, mesmo digest), </w:t>
+      </w:r>
+      <w:r>
+        <w:rPr>
+          <w:rFonts w:ascii="Segoe UI" w:cs="Segoe UI" w:eastAsia="Segoe UI" w:hAnsi="Segoe UI"/>
+          <w:b/>
+          <w:bCs/>
+          <w:i w:val="false"/>
+          <w:iCs w:val="false"/>
+          <w:color w:val="1A1A1A"/>
+          <w:sz w:val="20"/>
+          <w:szCs w:val="20"/>
+        </w:rPr>
+        <w:t xml:space="preserve">o DAST pegou um achado real</w:t>
+      </w:r>
+      <w:r>
+        <w:rPr>
+          <w:rFonts w:ascii="Segoe UI" w:cs="Segoe UI" w:eastAsia="Segoe UI" w:hAnsi="Segoe UI"/>
+          <w:b w:val="false"/>
+          <w:bCs w:val="false"/>
+          <w:i w:val="false"/>
+          <w:iCs w:val="false"/>
+          <w:color w:val="3A3A39"/>
+          <w:sz w:val="20"/>
+          <w:szCs w:val="20"/>
+        </w:rPr>
+        <w:t xml:space="preserve">: </w:t>
+      </w:r>
+      <w:r>
+        <w:rPr>
+          <w:rFonts w:ascii="Consolas" w:cs="Consolas" w:eastAsia="Consolas" w:hAnsi="Consolas"/>
+          <w:b w:val="false"/>
+          <w:bCs w:val="false"/>
+          <w:color w:val="3C4D7C"/>
+          <w:sz w:val="18"/>
+          <w:szCs w:val="18"/>
+          <w:shd w:fill="EAE6DF" w:val="clear"/>
+        </w:rPr>
+        <w:t xml:space="preserve">Strict-Transport-Security</w:t>
+      </w:r>
+      <w:r>
+        <w:rPr>
+          <w:rFonts w:ascii="Segoe UI" w:cs="Segoe UI" w:eastAsia="Segoe UI" w:hAnsi="Segoe UI"/>
+          <w:b w:val="false"/>
+          <w:bCs w:val="false"/>
+          <w:i w:val="false"/>
+          <w:iCs w:val="false"/>
+          <w:color w:val="3A3A39"/>
+          <w:sz w:val="20"/>
+          <w:szCs w:val="20"/>
+        </w:rPr>
+        <w:t xml:space="preserve"> duplicado (ZAP 10035, FAIL). O nginx e a API mandavam os mesmos cinco cabeçalhos de segurança; com dois HSTS na resposta a RFC 6797 manda o navegador ler só o primeiro, e uma divergência futura entre os dois valores passaria despercebida. A borda agora esconde os cabeçalhos que vêm da API (</w:t>
+      </w:r>
+      <w:r>
+        <w:rPr>
+          <w:rFonts w:ascii="Consolas" w:cs="Consolas" w:eastAsia="Consolas" w:hAnsi="Consolas"/>
+          <w:b w:val="false"/>
+          <w:bCs w:val="false"/>
+          <w:color w:val="3C4D7C"/>
+          <w:sz w:val="18"/>
+          <w:szCs w:val="18"/>
+          <w:shd w:fill="EAE6DF" w:val="clear"/>
+        </w:rPr>
+        <w:t xml:space="preserve">proxy_​hide_​header</w:t>
+      </w:r>
+      <w:r>
+        <w:rPr>
+          <w:rFonts w:ascii="Segoe UI" w:cs="Segoe UI" w:eastAsia="Segoe UI" w:hAnsi="Segoe UI"/>
+          <w:b w:val="false"/>
+          <w:bCs w:val="false"/>
+          <w:i w:val="false"/>
+          <w:iCs w:val="false"/>
+          <w:color w:val="3A3A39"/>
+          <w:sz w:val="20"/>
+          <w:szCs w:val="20"/>
+        </w:rPr>
+        <w:t xml:space="preserve">) e passou a mandar também </w:t>
+      </w:r>
+      <w:r>
+        <w:rPr>
+          <w:rFonts w:ascii="Consolas" w:cs="Consolas" w:eastAsia="Consolas" w:hAnsi="Consolas"/>
+          <w:b w:val="false"/>
+          <w:bCs w:val="false"/>
+          <w:color w:val="3C4D7C"/>
+          <w:sz w:val="18"/>
+          <w:szCs w:val="18"/>
+          <w:shd w:fill="EAE6DF" w:val="clear"/>
+        </w:rPr>
+        <w:t xml:space="preserve">Cross-Origin-Resource-Policy</w:t>
+      </w:r>
+      <w:r>
+        <w:rPr>
+          <w:rFonts w:ascii="Segoe UI" w:cs="Segoe UI" w:eastAsia="Segoe UI" w:hAnsi="Segoe UI"/>
+          <w:b w:val="false"/>
+          <w:bCs w:val="false"/>
+          <w:i w:val="false"/>
+          <w:iCs w:val="false"/>
+          <w:color w:val="3A3A39"/>
+          <w:sz w:val="20"/>
+          <w:szCs w:val="20"/>
+        </w:rPr>
+        <w:t xml:space="preserve"> e </w:t>
+      </w:r>
+      <w:r>
+        <w:rPr>
+          <w:rFonts w:ascii="Consolas" w:cs="Consolas" w:eastAsia="Consolas" w:hAnsi="Consolas"/>
+          <w:b w:val="false"/>
+          <w:bCs w:val="false"/>
+          <w:color w:val="3C4D7C"/>
+          <w:sz w:val="18"/>
+          <w:szCs w:val="18"/>
+          <w:shd w:fill="EAE6DF" w:val="clear"/>
+        </w:rPr>
+        <w:t xml:space="preserve">Cache-Control: no-store</w:t>
+      </w:r>
+      <w:r>
+        <w:rPr>
+          <w:rFonts w:ascii="Segoe UI" w:cs="Segoe UI" w:eastAsia="Segoe UI" w:hAnsi="Segoe UI"/>
+          <w:b w:val="false"/>
+          <w:bCs w:val="false"/>
+          <w:i w:val="false"/>
+          <w:iCs w:val="false"/>
+          <w:color w:val="3A3A39"/>
+          <w:sz w:val="20"/>
+          <w:szCs w:val="20"/>
+        </w:rPr>
+        <w:t xml:space="preserve">, que o ZAP tinha deixado como aviso.</w:t>
+      </w:r>
+    </w:p>
+    <w:p>
+      <w:pPr>
         <w:pStyle w:val="Heading2"/>
         <w:keepNext/>
         <w:keepLines/>
@@ -19642,7 +19813,57 @@
           <w:sz w:val="20"/>
           <w:szCs w:val="20"/>
         </w:rPr>
-        <w:t xml:space="preserve">, sem </w:t>
+        <w:t xml:space="preserve">, </w:t>
+      </w:r>
+      <w:r>
+        <w:rPr>
+          <w:rFonts w:ascii="Consolas" w:cs="Consolas" w:eastAsia="Consolas" w:hAnsi="Consolas"/>
+          <w:b w:val="false"/>
+          <w:bCs w:val="false"/>
+          <w:color w:val="3C4D7C"/>
+          <w:sz w:val="18"/>
+          <w:szCs w:val="18"/>
+          <w:shd w:fill="EAE6DF" w:val="clear"/>
+        </w:rPr>
+        <w:t xml:space="preserve">Cross-Origin-Resource-Policy</w:t>
+      </w:r>
+      <w:r>
+        <w:rPr>
+          <w:rFonts w:ascii="Segoe UI" w:cs="Segoe UI" w:eastAsia="Segoe UI" w:hAnsi="Segoe UI"/>
+          <w:b w:val="false"/>
+          <w:bCs w:val="false"/>
+          <w:i w:val="false"/>
+          <w:iCs w:val="false"/>
+          <w:color w:val="3A3A39"/>
+          <w:sz w:val="20"/>
+          <w:szCs w:val="20"/>
+        </w:rPr>
+        <w:t xml:space="preserve"> e </w:t>
+      </w:r>
+      <w:r>
+        <w:rPr>
+          <w:rFonts w:ascii="Consolas" w:cs="Consolas" w:eastAsia="Consolas" w:hAnsi="Consolas"/>
+          <w:b w:val="false"/>
+          <w:bCs w:val="false"/>
+          <w:color w:val="3C4D7C"/>
+          <w:sz w:val="18"/>
+          <w:szCs w:val="18"/>
+          <w:shd w:fill="EAE6DF" w:val="clear"/>
+        </w:rPr>
+        <w:t xml:space="preserve">Cache-Control: no-store</w:t>
+      </w:r>
+      <w:r>
+        <w:rPr>
+          <w:rFonts w:ascii="Segoe UI" w:cs="Segoe UI" w:eastAsia="Segoe UI" w:hAnsi="Segoe UI"/>
+          <w:b w:val="false"/>
+          <w:bCs w:val="false"/>
+          <w:i w:val="false"/>
+          <w:iCs w:val="false"/>
+          <w:color w:val="3A3A39"/>
+          <w:sz w:val="20"/>
+          <w:szCs w:val="20"/>
+        </w:rPr>
+        <w:t xml:space="preserve"> (resposta com PII), cada um uma vez só na resposta, sem </w:t>
       </w:r>
       <w:r>
         <w:rPr>
@@ -48850,9 +49071,9 @@
         <w:tblLayout w:type="fixed"/>
       </w:tblPr>
       <w:tblGrid>
-        <w:gridCol w:w="3088"/>
-        <w:gridCol w:w="2908"/>
-        <w:gridCol w:w="3642"/>
+        <w:gridCol w:w="2986"/>
+        <w:gridCol w:w="2965"/>
+        <w:gridCol w:w="3687"/>
       </w:tblGrid>
       <w:tr>
         <w:trPr>
@@ -48861,7 +49082,7 @@
         </w:trPr>
         <w:tc>
           <w:tcPr>
-            <w:tcW w:type="dxa" w:w="3088"/>
+            <w:tcW w:type="dxa" w:w="2986"/>
             <w:tcBorders>
               <w:top w:val="single" w:color="D9D5CD" w:sz="2"/>
               <w:left w:val="single" w:color="D9D5CD" w:sz="2"/>
@@ -48895,7 +49116,7 @@
         </w:tc>
         <w:tc>
           <w:tcPr>
-            <w:tcW w:type="dxa" w:w="2908"/>
+            <w:tcW w:type="dxa" w:w="2965"/>
             <w:tcBorders>
               <w:top w:val="single" w:color="D9D5CD" w:sz="2"/>
               <w:left w:val="single" w:color="D9D5CD" w:sz="2"/>
@@ -48929,7 +49150,7 @@
         </w:tc>
         <w:tc>
           <w:tcPr>
-            <w:tcW w:type="dxa" w:w="3642"/>
+            <w:tcW w:type="dxa" w:w="3687"/>
             <w:tcBorders>
               <w:top w:val="single" w:color="D9D5CD" w:sz="2"/>
               <w:left w:val="single" w:color="D9D5CD" w:sz="2"/>
@@ -48968,7 +49189,7 @@
         </w:trPr>
         <w:tc>
           <w:tcPr>
-            <w:tcW w:type="dxa" w:w="3088"/>
+            <w:tcW w:type="dxa" w:w="2986"/>
             <w:tcBorders>
               <w:top w:val="single" w:color="D9D5CD" w:sz="2"/>
               <w:left w:val="single" w:color="D9D5CD" w:sz="2"/>
@@ -49005,7 +49226,7 @@
         </w:tc>
         <w:tc>
           <w:tcPr>
-            <w:tcW w:type="dxa" w:w="2908"/>
+            <w:tcW w:type="dxa" w:w="2965"/>
             <w:tcBorders>
               <w:top w:val="single" w:color="D9D5CD" w:sz="2"/>
               <w:left w:val="single" w:color="D9D5CD" w:sz="2"/>
@@ -49042,7 +49263,7 @@
         </w:tc>
         <w:tc>
           <w:tcPr>
-            <w:tcW w:type="dxa" w:w="3642"/>
+            <w:tcW w:type="dxa" w:w="3687"/>
             <w:tcBorders>
               <w:top w:val="single" w:color="D9D5CD" w:sz="2"/>
               <w:left w:val="single" w:color="D9D5CD" w:sz="2"/>
@@ -49084,7 +49305,7 @@
         </w:trPr>
         <w:tc>
           <w:tcPr>
-            <w:tcW w:type="dxa" w:w="3088"/>
+            <w:tcW w:type="dxa" w:w="2986"/>
             <w:tcBorders>
               <w:top w:val="single" w:color="D9D5CD" w:sz="2"/>
               <w:left w:val="single" w:color="D9D5CD" w:sz="2"/>
@@ -49121,7 +49342,7 @@
         </w:tc>
         <w:tc>
           <w:tcPr>
-            <w:tcW w:type="dxa" w:w="2908"/>
+            <w:tcW w:type="dxa" w:w="2965"/>
             <w:tcBorders>
               <w:top w:val="single" w:color="D9D5CD" w:sz="2"/>
               <w:left w:val="single" w:color="D9D5CD" w:sz="2"/>
@@ -49158,7 +49379,7 @@
         </w:tc>
         <w:tc>
           <w:tcPr>
-            <w:tcW w:type="dxa" w:w="3642"/>
+            <w:tcW w:type="dxa" w:w="3687"/>
             <w:tcBorders>
               <w:top w:val="single" w:color="D9D5CD" w:sz="2"/>
               <w:left w:val="single" w:color="D9D5CD" w:sz="2"/>
@@ -49200,7 +49421,7 @@
         </w:trPr>
         <w:tc>
           <w:tcPr>
-            <w:tcW w:type="dxa" w:w="3088"/>
+            <w:tcW w:type="dxa" w:w="2986"/>
             <w:tcBorders>
               <w:top w:val="single" w:color="D9D5CD" w:sz="2"/>
               <w:left w:val="single" w:color="D9D5CD" w:sz="2"/>
@@ -49237,7 +49458,7 @@
         </w:tc>
         <w:tc>
           <w:tcPr>
-            <w:tcW w:type="dxa" w:w="2908"/>
+            <w:tcW w:type="dxa" w:w="2965"/>
             <w:tcBorders>
               <w:top w:val="single" w:color="D9D5CD" w:sz="2"/>
               <w:left w:val="single" w:color="D9D5CD" w:sz="2"/>
@@ -49274,7 +49495,7 @@
         </w:tc>
         <w:tc>
           <w:tcPr>
-            <w:tcW w:type="dxa" w:w="3642"/>
+            <w:tcW w:type="dxa" w:w="3687"/>
             <w:tcBorders>
               <w:top w:val="single" w:color="D9D5CD" w:sz="2"/>
               <w:left w:val="single" w:color="D9D5CD" w:sz="2"/>
@@ -49341,7 +49562,7 @@
         </w:trPr>
         <w:tc>
           <w:tcPr>
-            <w:tcW w:type="dxa" w:w="3088"/>
+            <w:tcW w:type="dxa" w:w="2986"/>
             <w:tcBorders>
               <w:top w:val="single" w:color="D9D5CD" w:sz="2"/>
               <w:left w:val="single" w:color="D9D5CD" w:sz="2"/>
@@ -49378,7 +49599,7 @@
         </w:tc>
         <w:tc>
           <w:tcPr>
-            <w:tcW w:type="dxa" w:w="2908"/>
+            <w:tcW w:type="dxa" w:w="2965"/>
             <w:tcBorders>
               <w:top w:val="single" w:color="D9D5CD" w:sz="2"/>
               <w:left w:val="single" w:color="D9D5CD" w:sz="2"/>
@@ -49415,7 +49636,7 @@
         </w:tc>
         <w:tc>
           <w:tcPr>
-            <w:tcW w:type="dxa" w:w="3642"/>
+            <w:tcW w:type="dxa" w:w="3687"/>
             <w:tcBorders>
               <w:top w:val="single" w:color="D9D5CD" w:sz="2"/>
               <w:left w:val="single" w:color="D9D5CD" w:sz="2"/>
@@ -49457,7 +49678,7 @@
         </w:trPr>
         <w:tc>
           <w:tcPr>
-            <w:tcW w:type="dxa" w:w="3088"/>
+            <w:tcW w:type="dxa" w:w="2986"/>
             <w:tcBorders>
               <w:top w:val="single" w:color="D9D5CD" w:sz="2"/>
               <w:left w:val="single" w:color="D9D5CD" w:sz="2"/>
@@ -49494,7 +49715,7 @@
         </w:tc>
         <w:tc>
           <w:tcPr>
-            <w:tcW w:type="dxa" w:w="2908"/>
+            <w:tcW w:type="dxa" w:w="2965"/>
             <w:tcBorders>
               <w:top w:val="single" w:color="D9D5CD" w:sz="2"/>
               <w:left w:val="single" w:color="D9D5CD" w:sz="2"/>
@@ -49531,7 +49752,7 @@
         </w:tc>
         <w:tc>
           <w:tcPr>
-            <w:tcW w:type="dxa" w:w="3642"/>
+            <w:tcW w:type="dxa" w:w="3687"/>
             <w:tcBorders>
               <w:top w:val="single" w:color="D9D5CD" w:sz="2"/>
               <w:left w:val="single" w:color="D9D5CD" w:sz="2"/>
@@ -49573,7 +49794,7 @@
         </w:trPr>
         <w:tc>
           <w:tcPr>
-            <w:tcW w:type="dxa" w:w="3088"/>
+            <w:tcW w:type="dxa" w:w="2986"/>
             <w:tcBorders>
               <w:top w:val="single" w:color="D9D5CD" w:sz="2"/>
               <w:left w:val="single" w:color="D9D5CD" w:sz="2"/>
@@ -49622,7 +49843,7 @@
         </w:tc>
         <w:tc>
           <w:tcPr>
-            <w:tcW w:type="dxa" w:w="2908"/>
+            <w:tcW w:type="dxa" w:w="2965"/>
             <w:tcBorders>
               <w:top w:val="single" w:color="D9D5CD" w:sz="2"/>
               <w:left w:val="single" w:color="D9D5CD" w:sz="2"/>
@@ -49659,7 +49880,7 @@
         </w:tc>
         <w:tc>
           <w:tcPr>
-            <w:tcW w:type="dxa" w:w="3642"/>
+            <w:tcW w:type="dxa" w:w="3687"/>
             <w:tcBorders>
               <w:top w:val="single" w:color="D9D5CD" w:sz="2"/>
               <w:left w:val="single" w:color="D9D5CD" w:sz="2"/>
@@ -49776,7 +49997,7 @@
         </w:trPr>
         <w:tc>
           <w:tcPr>
-            <w:tcW w:type="dxa" w:w="3088"/>
+            <w:tcW w:type="dxa" w:w="2986"/>
             <w:tcBorders>
               <w:top w:val="single" w:color="D9D5CD" w:sz="2"/>
               <w:left w:val="single" w:color="D9D5CD" w:sz="2"/>
@@ -49807,13 +50028,13 @@
                 <w:sz w:val="16"/>
                 <w:szCs w:val="16"/>
               </w:rPr>
-              <w:t xml:space="preserve">ZAP não executado localmente</w:t>
-            </w:r>
-          </w:p>
-        </w:tc>
-        <w:tc>
-          <w:tcPr>
-            <w:tcW w:type="dxa" w:w="2908"/>
+              <w:t xml:space="preserve">ZAP só em modo baseline (passivo)</w:t>
+            </w:r>
+          </w:p>
+        </w:tc>
+        <w:tc>
+          <w:tcPr>
+            <w:tcW w:type="dxa" w:w="2965"/>
             <w:tcBorders>
               <w:top w:val="single" w:color="D9D5CD" w:sz="2"/>
               <w:left w:val="single" w:color="D9D5CD" w:sz="2"/>
@@ -49844,13 +50065,13 @@
                 <w:sz w:val="16"/>
                 <w:szCs w:val="16"/>
               </w:rPr>
-              <w:t xml:space="preserve">imagem de ~1,5 GB e máquina no limite</w:t>
-            </w:r>
-          </w:p>
-        </w:tc>
-        <w:tc>
-          <w:tcPr>
-            <w:tcW w:type="dxa" w:w="3642"/>
+              <w:t xml:space="preserve">o scan ativo demora mais que o job e grava dados de teste</w:t>
+            </w:r>
+          </w:p>
+        </w:tc>
+        <w:tc>
+          <w:tcPr>
+            <w:tcW w:type="dxa" w:w="3687"/>
             <w:tcBorders>
               <w:top w:val="single" w:color="D9D5CD" w:sz="2"/>
               <w:left w:val="single" w:color="D9D5CD" w:sz="2"/>
@@ -49881,7 +50102,7 @@
                 <w:sz w:val="16"/>
                 <w:szCs w:val="16"/>
               </w:rPr>
-              <w:t xml:space="preserve">roda no job 7 do pipeline</w:t>
+              <w:t xml:space="preserve">full scan autenticado no staging antes do piloto</w:t>
             </w:r>
           </w:p>
         </w:tc>

</xml_diff>

<commit_message>
ci: SARIF do semgrep sem achado ja justificado com nosemgrep
o github abria alerta pro login e refresh mesmo com a excecao no codigo.
codeowners passa a cobrir as rotas e os arquivos de excecao dos scanners,
dependabot sem labels que nao existem no repo e documento com o run #17 verde.
</commit_message>
<xml_diff>
--- a/docs/Sprint3-Cybersecurity.docx
+++ b/docs/Sprint3-Cybersecurity.docx
@@ -11552,6 +11552,336 @@
     </w:p>
     <w:p>
       <w:pPr>
+        <w:keepNext w:val="false"/>
+        <w:spacing w:after="140" w:before="80" w:line="288"/>
+        <w:jc w:val="left"/>
+      </w:pPr>
+      <w:r>
+        <w:rPr>
+          <w:rFonts w:ascii="Segoe UI" w:cs="Segoe UI" w:eastAsia="Segoe UI" w:hAnsi="Segoe UI"/>
+          <w:b w:val="false"/>
+          <w:bCs w:val="false"/>
+          <w:i w:val="false"/>
+          <w:iCs w:val="false"/>
+          <w:color w:val="3A3A39"/>
+          <w:sz w:val="20"/>
+          <w:szCs w:val="20"/>
+        </w:rPr>
+        <w:t xml:space="preserve">Na execução seguinte (run #17, commit </w:t>
+      </w:r>
+      <w:r>
+        <w:rPr>
+          <w:rFonts w:ascii="Consolas" w:cs="Consolas" w:eastAsia="Consolas" w:hAnsi="Consolas"/>
+          <w:b w:val="false"/>
+          <w:bCs w:val="false"/>
+          <w:color w:val="3C4D7C"/>
+          <w:sz w:val="18"/>
+          <w:szCs w:val="18"/>
+          <w:shd w:fill="EAE6DF" w:val="clear"/>
+        </w:rPr>
+        <w:t xml:space="preserve">638fb66</w:t>
+      </w:r>
+      <w:r>
+        <w:rPr>
+          <w:rFonts w:ascii="Segoe UI" w:cs="Segoe UI" w:eastAsia="Segoe UI" w:hAnsi="Segoe UI"/>
+          <w:b w:val="false"/>
+          <w:bCs w:val="false"/>
+          <w:i w:val="false"/>
+          <w:iCs w:val="false"/>
+          <w:color w:val="3A3A39"/>
+          <w:sz w:val="20"/>
+          <w:szCs w:val="20"/>
+        </w:rPr>
+        <w:t xml:space="preserve">) </w:t>
+      </w:r>
+      <w:r>
+        <w:rPr>
+          <w:rFonts w:ascii="Segoe UI" w:cs="Segoe UI" w:eastAsia="Segoe UI" w:hAnsi="Segoe UI"/>
+          <w:b/>
+          <w:bCs/>
+          <w:i w:val="false"/>
+          <w:iCs w:val="false"/>
+          <w:color w:val="1A1A1A"/>
+          <w:sz w:val="20"/>
+          <w:szCs w:val="20"/>
+        </w:rPr>
+        <w:t xml:space="preserve">os nove estágios passaram</w:t>
+      </w:r>
+      <w:r>
+        <w:rPr>
+          <w:rFonts w:ascii="Segoe UI" w:cs="Segoe UI" w:eastAsia="Segoe UI" w:hAnsi="Segoe UI"/>
+          <w:b w:val="false"/>
+          <w:bCs w:val="false"/>
+          <w:i w:val="false"/>
+          <w:iCs w:val="false"/>
+          <w:color w:val="3A3A39"/>
+          <w:sz w:val="20"/>
+          <w:szCs w:val="20"/>
+        </w:rPr>
+        <w:t xml:space="preserve"> em 6 min 39 s: a imagem foi publicada em </w:t>
+      </w:r>
+      <w:r>
+        <w:rPr>
+          <w:rFonts w:ascii="Consolas" w:cs="Consolas" w:eastAsia="Consolas" w:hAnsi="Consolas"/>
+          <w:b w:val="false"/>
+          <w:bCs w:val="false"/>
+          <w:color w:val="3C4D7C"/>
+          <w:sz w:val="18"/>
+          <w:szCs w:val="18"/>
+          <w:shd w:fill="EAE6DF" w:val="clear"/>
+        </w:rPr>
+        <w:t xml:space="preserve">ghcr.io/​lynnbrosa/​previopls-security</w:t>
+      </w:r>
+      <w:r>
+        <w:rPr>
+          <w:rFonts w:ascii="Segoe UI" w:cs="Segoe UI" w:eastAsia="Segoe UI" w:hAnsi="Segoe UI"/>
+          <w:b w:val="false"/>
+          <w:bCs w:val="false"/>
+          <w:i w:val="false"/>
+          <w:iCs w:val="false"/>
+          <w:color w:val="3A3A39"/>
+          <w:sz w:val="20"/>
+          <w:szCs w:val="20"/>
+        </w:rPr>
+        <w:t xml:space="preserve"> com assinatura cosign, e o deploy fica parado (skipped) até existir o ambiente </w:t>
+      </w:r>
+      <w:r>
+        <w:rPr>
+          <w:rFonts w:ascii="Consolas" w:cs="Consolas" w:eastAsia="Consolas" w:hAnsi="Consolas"/>
+          <w:b w:val="false"/>
+          <w:bCs w:val="false"/>
+          <w:color w:val="3C4D7C"/>
+          <w:sz w:val="18"/>
+          <w:szCs w:val="18"/>
+          <w:shd w:fill="EAE6DF" w:val="clear"/>
+        </w:rPr>
+        <w:t xml:space="preserve">production</w:t>
+      </w:r>
+      <w:r>
+        <w:rPr>
+          <w:rFonts w:ascii="Segoe UI" w:cs="Segoe UI" w:eastAsia="Segoe UI" w:hAnsi="Segoe UI"/>
+          <w:b w:val="false"/>
+          <w:bCs w:val="false"/>
+          <w:i w:val="false"/>
+          <w:iCs w:val="false"/>
+          <w:color w:val="3A3A39"/>
+          <w:sz w:val="20"/>
+          <w:szCs w:val="20"/>
+        </w:rPr>
+        <w:t xml:space="preserve"> com revisores e a variável </w:t>
+      </w:r>
+      <w:r>
+        <w:rPr>
+          <w:rFonts w:ascii="Consolas" w:cs="Consolas" w:eastAsia="Consolas" w:hAnsi="Consolas"/>
+          <w:b w:val="false"/>
+          <w:bCs w:val="false"/>
+          <w:color w:val="3C4D7C"/>
+          <w:sz w:val="18"/>
+          <w:szCs w:val="18"/>
+          <w:shd w:fill="EAE6DF" w:val="clear"/>
+        </w:rPr>
+        <w:t xml:space="preserve">DEPLOY_​ENABLED</w:t>
+      </w:r>
+      <w:r>
+        <w:rPr>
+          <w:rFonts w:ascii="Segoe UI" w:cs="Segoe UI" w:eastAsia="Segoe UI" w:hAnsi="Segoe UI"/>
+          <w:b w:val="false"/>
+          <w:bCs w:val="false"/>
+          <w:i w:val="false"/>
+          <w:iCs w:val="false"/>
+          <w:color w:val="3A3A39"/>
+          <w:sz w:val="20"/>
+          <w:szCs w:val="20"/>
+        </w:rPr>
+        <w:t xml:space="preserve">.</w:t>
+      </w:r>
+    </w:p>
+    <w:p>
+      <w:pPr>
+        <w:keepNext/>
+        <w:spacing w:after="140" w:before="80" w:line="288"/>
+        <w:jc w:val="left"/>
+      </w:pPr>
+      <w:r>
+        <w:rPr>
+          <w:rFonts w:ascii="Segoe UI" w:cs="Segoe UI" w:eastAsia="Segoe UI" w:hAnsi="Segoe UI"/>
+          <w:b w:val="false"/>
+          <w:bCs w:val="false"/>
+          <w:i w:val="false"/>
+          <w:iCs w:val="false"/>
+          <w:color w:val="3A3A39"/>
+          <w:sz w:val="20"/>
+          <w:szCs w:val="20"/>
+        </w:rPr>
+        <w:t xml:space="preserve">O Code scanning do GitHub ainda mostrava 2 alertas </w:t>
+      </w:r>
+      <w:r>
+        <w:rPr>
+          <w:rFonts w:ascii="Consolas" w:cs="Consolas" w:eastAsia="Consolas" w:hAnsi="Consolas"/>
+          <w:b w:val="false"/>
+          <w:bCs w:val="false"/>
+          <w:color w:val="3C4D7C"/>
+          <w:sz w:val="18"/>
+          <w:szCs w:val="18"/>
+          <w:shd w:fill="EAE6DF" w:val="clear"/>
+        </w:rPr>
+        <w:t xml:space="preserve">rota-sem-controle-de-acesso</w:t>
+      </w:r>
+      <w:r>
+        <w:rPr>
+          <w:rFonts w:ascii="Segoe UI" w:cs="Segoe UI" w:eastAsia="Segoe UI" w:hAnsi="Segoe UI"/>
+          <w:b w:val="false"/>
+          <w:bCs w:val="false"/>
+          <w:i w:val="false"/>
+          <w:iCs w:val="false"/>
+          <w:color w:val="3A3A39"/>
+          <w:sz w:val="20"/>
+          <w:szCs w:val="20"/>
+        </w:rPr>
+        <w:t xml:space="preserve"> em </w:t>
+      </w:r>
+      <w:r>
+        <w:rPr>
+          <w:rFonts w:ascii="Consolas" w:cs="Consolas" w:eastAsia="Consolas" w:hAnsi="Consolas"/>
+          <w:b w:val="false"/>
+          <w:bCs w:val="false"/>
+          <w:color w:val="3C4D7C"/>
+          <w:sz w:val="18"/>
+          <w:szCs w:val="18"/>
+          <w:shd w:fill="EAE6DF" w:val="clear"/>
+        </w:rPr>
+        <w:t xml:space="preserve">auth.py</w:t>
+      </w:r>
+      <w:r>
+        <w:rPr>
+          <w:rFonts w:ascii="Segoe UI" w:cs="Segoe UI" w:eastAsia="Segoe UI" w:hAnsi="Segoe UI"/>
+          <w:b w:val="false"/>
+          <w:bCs w:val="false"/>
+          <w:i w:val="false"/>
+          <w:iCs w:val="false"/>
+          <w:color w:val="3A3A39"/>
+          <w:sz w:val="20"/>
+          <w:szCs w:val="20"/>
+        </w:rPr>
+        <w:t xml:space="preserve">: são o login e o refresh, públicos de propósito e marcados com </w:t>
+      </w:r>
+      <w:r>
+        <w:rPr>
+          <w:rFonts w:ascii="Consolas" w:cs="Consolas" w:eastAsia="Consolas" w:hAnsi="Consolas"/>
+          <w:b w:val="false"/>
+          <w:bCs w:val="false"/>
+          <w:color w:val="3C4D7C"/>
+          <w:sz w:val="18"/>
+          <w:szCs w:val="18"/>
+          <w:shd w:fill="EAE6DF" w:val="clear"/>
+        </w:rPr>
+        <w:t xml:space="preserve">nosemgrep</w:t>
+      </w:r>
+      <w:r>
+        <w:rPr>
+          <w:rFonts w:ascii="Segoe UI" w:cs="Segoe UI" w:eastAsia="Segoe UI" w:hAnsi="Segoe UI"/>
+          <w:b w:val="false"/>
+          <w:bCs w:val="false"/>
+          <w:i w:val="false"/>
+          <w:iCs w:val="false"/>
+          <w:color w:val="3A3A39"/>
+          <w:sz w:val="20"/>
+          <w:szCs w:val="20"/>
+        </w:rPr>
+        <w:t xml:space="preserve"> e o motivo. O gate já os ignorava, mas o semgrep grava a exceção no SARIF (</w:t>
+      </w:r>
+      <w:r>
+        <w:rPr>
+          <w:rFonts w:ascii="Consolas" w:cs="Consolas" w:eastAsia="Consolas" w:hAnsi="Consolas"/>
+          <w:b w:val="false"/>
+          <w:bCs w:val="false"/>
+          <w:color w:val="3C4D7C"/>
+          <w:sz w:val="18"/>
+          <w:szCs w:val="18"/>
+          <w:shd w:fill="EAE6DF" w:val="clear"/>
+        </w:rPr>
+        <w:t xml:space="preserve">suppressions: inSource</w:t>
+      </w:r>
+      <w:r>
+        <w:rPr>
+          <w:rFonts w:ascii="Segoe UI" w:cs="Segoe UI" w:eastAsia="Segoe UI" w:hAnsi="Segoe UI"/>
+          <w:b w:val="false"/>
+          <w:bCs w:val="false"/>
+          <w:i w:val="false"/>
+          <w:iCs w:val="false"/>
+          <w:color w:val="3A3A39"/>
+          <w:sz w:val="20"/>
+          <w:szCs w:val="20"/>
+        </w:rPr>
+        <w:t xml:space="preserve">) e o GitHub abre alerta mesmo assim. O job agora tira do SARIF o que já tem exceção justificada no código; a exceção continua visível no próprio código e passa pela revisão do CODEOWNERS.</w:t>
+      </w:r>
+    </w:p>
+    <w:p>
+      <w:pPr>
+        <w:keepNext/>
+        <w:spacing w:after="60" w:before="200"/>
+        <w:jc w:val="center"/>
+      </w:pPr>
+      <w:r>
+        <w:drawing>
+          <wp:inline distT="0" distB="0" distL="0" distR="0">
+            <wp:extent cx="6120130" cy="3481011"/>
+            <wp:effectExtent t="0" r="0" b="0" l="0"/>
+            <wp:docPr id="1" name="" descr="" title=""/>
+            <wp:cNvGraphicFramePr>
+              <a:graphicFrameLocks xmlns:a="http://schemas.openxmlformats.org/drawingml/2006/main" noChangeAspect="1"/>
+            </wp:cNvGraphicFramePr>
+            <a:graphic xmlns:a="http://schemas.openxmlformats.org/drawingml/2006/main">
+              <a:graphicData uri="http://schemas.openxmlformats.org/drawingml/2006/picture">
+                <pic:pic xmlns:pic="http://schemas.openxmlformats.org/drawingml/2006/picture">
+                  <pic:nvPicPr>
+                    <pic:cNvPr id="0" name="" descr=""/>
+                    <pic:cNvPicPr>
+                      <a:picLocks noChangeAspect="1" noChangeArrowheads="1"/>
+                    </pic:cNvPicPr>
+                  </pic:nvPicPr>
+                  <pic:blipFill>
+                    <a:blip r:embed="rId16" cstate="none"/>
+                    <a:srcRect/>
+                    <a:stretch>
+                      <a:fillRect/>
+                    </a:stretch>
+                  </pic:blipFill>
+                  <pic:spPr bwMode="auto">
+                    <a:xfrm>
+                      <a:off x="0" y="0"/>
+                      <a:ext cx="6120130" cy="3481011"/>
+                    </a:xfrm>
+                    <a:prstGeom prst="rect">
+                      <a:avLst/>
+                    </a:prstGeom>
+                  </pic:spPr>
+                </pic:pic>
+              </a:graphicData>
+            </a:graphic>
+          </wp:inline>
+        </w:drawing>
+      </w:r>
+    </w:p>
+    <w:p>
+      <w:pPr>
+        <w:spacing w:after="240" w:before="0"/>
+        <w:jc w:val="center"/>
+      </w:pPr>
+      <w:r>
+        <w:rPr>
+          <w:rFonts w:ascii="Segoe UI" w:cs="Segoe UI" w:eastAsia="Segoe UI" w:hAnsi="Segoe UI"/>
+          <w:i/>
+          <w:iCs/>
+          <w:color w:val="6B6B6B"/>
+          <w:sz w:val="16"/>
+          <w:szCs w:val="16"/>
+        </w:rPr>
+        <w:t xml:space="preserve">Pipeline DevSecOps aprovado no GitHub Actions (run #17)</w:t>
+      </w:r>
+    </w:p>
+    <w:p>
+      <w:pPr>
         <w:pStyle w:val="Heading2"/>
         <w:keepNext/>
         <w:keepLines/>
@@ -23897,7 +24227,7 @@
                     </pic:cNvPicPr>
                   </pic:nvPicPr>
                   <pic:blipFill>
-                    <a:blip r:embed="rId16" cstate="none"/>
+                    <a:blip r:embed="rId17" cstate="none"/>
                     <a:srcRect/>
                     <a:stretch>
                       <a:fillRect/>
@@ -27151,7 +27481,7 @@
                     </pic:cNvPicPr>
                   </pic:nvPicPr>
                   <pic:blipFill>
-                    <a:blip r:embed="rId17" cstate="none"/>
+                    <a:blip r:embed="rId18" cstate="none"/>
                     <a:srcRect/>
                     <a:stretch>
                       <a:fillRect/>
@@ -27248,7 +27578,7 @@
                     </pic:cNvPicPr>
                   </pic:nvPicPr>
                   <pic:blipFill>
-                    <a:blip r:embed="rId18" cstate="none"/>
+                    <a:blip r:embed="rId19" cstate="none"/>
                     <a:srcRect/>
                     <a:stretch>
                       <a:fillRect/>
@@ -27345,7 +27675,7 @@
                     </pic:cNvPicPr>
                   </pic:nvPicPr>
                   <pic:blipFill>
-                    <a:blip r:embed="rId19" cstate="none"/>
+                    <a:blip r:embed="rId20" cstate="none"/>
                     <a:srcRect/>
                     <a:stretch>
                       <a:fillRect/>
@@ -27409,7 +27739,7 @@
                     </pic:cNvPicPr>
                   </pic:nvPicPr>
                   <pic:blipFill>
-                    <a:blip r:embed="rId20" cstate="none"/>
+                    <a:blip r:embed="rId21" cstate="none"/>
                     <a:srcRect/>
                     <a:stretch>
                       <a:fillRect/>
@@ -27506,7 +27836,7 @@
                     </pic:cNvPicPr>
                   </pic:nvPicPr>
                   <pic:blipFill>
-                    <a:blip r:embed="rId21" cstate="none"/>
+                    <a:blip r:embed="rId22" cstate="none"/>
                     <a:srcRect/>
                     <a:stretch>
                       <a:fillRect/>
@@ -27590,7 +27920,7 @@
                     </pic:cNvPicPr>
                   </pic:nvPicPr>
                   <pic:blipFill>
-                    <a:blip r:embed="rId22" cstate="none"/>
+                    <a:blip r:embed="rId23" cstate="none"/>
                     <a:srcRect/>
                     <a:stretch>
                       <a:fillRect/>
@@ -50452,6 +50782,132 @@
                 <w:szCs w:val="14"/>
               </w:rPr>
               <w:t xml:space="preserve">ee289d2 chore(sast): login e refresh marcados como publicos de proposito na regra do semgrep</w:t>
+            </w:r>
+          </w:p>
+          <w:p>
+            <w:pPr>
+              <w:spacing w:after="0" w:before="0" w:line="236"/>
+            </w:pPr>
+            <w:r>
+              <w:rPr>
+                <w:rFonts w:ascii="Consolas" w:cs="Consolas" w:eastAsia="Consolas" w:hAnsi="Consolas"/>
+                <w:color w:val="E4E7EB"/>
+                <w:sz w:val="14"/>
+                <w:szCs w:val="14"/>
+              </w:rPr>
+              <w:t xml:space="preserve">fef3568 docs: documento da sprint 3, diagramas, runbooks e evidencias de execucao</w:t>
+            </w:r>
+          </w:p>
+          <w:p>
+            <w:pPr>
+              <w:spacing w:after="0" w:before="0" w:line="236"/>
+            </w:pPr>
+            <w:r>
+              <w:rPr>
+                <w:rFonts w:ascii="Consolas" w:cs="Consolas" w:eastAsia="Consolas" w:hAnsi="Consolas"/>
+                <w:color w:val="E4E7EB"/>
+                <w:sz w:val="14"/>
+                <w:szCs w:val="14"/>
+              </w:rPr>
+              <w:t xml:space="preserve">f4de7fc docs: evidencias sem caminho local da maquina e pdf regerado</w:t>
+            </w:r>
+          </w:p>
+          <w:p>
+            <w:pPr>
+              <w:spacing w:after="0" w:before="0" w:line="236"/>
+            </w:pPr>
+            <w:r>
+              <w:rPr>
+                <w:rFonts w:ascii="Consolas" w:cs="Consolas" w:eastAsia="Consolas" w:hAnsi="Consolas"/>
+                <w:color w:val="E4E7EB"/>
+                <w:sz w:val="14"/>
+                <w:szCs w:val="14"/>
+              </w:rPr>
+              <w:t xml:space="preserve">a936b83 ci: corrige o workflow depois da primeira execucao no github</w:t>
+            </w:r>
+          </w:p>
+          <w:p>
+            <w:pPr>
+              <w:spacing w:after="0" w:before="0" w:line="236"/>
+            </w:pPr>
+            <w:r>
+              <w:rPr>
+                <w:rFonts w:ascii="Consolas" w:cs="Consolas" w:eastAsia="Consolas" w:hAnsi="Consolas"/>
+                <w:color w:val="E4E7EB"/>
+                <w:sz w:val="14"/>
+                <w:szCs w:val="14"/>
+              </w:rPr>
+              <w:t xml:space="preserve">b855fee docs: registra a primeira execucao do pipeline no github</w:t>
+            </w:r>
+          </w:p>
+          <w:p>
+            <w:pPr>
+              <w:spacing w:after="0" w:before="0" w:line="236"/>
+            </w:pPr>
+            <w:r>
+              <w:rPr>
+                <w:rFonts w:ascii="Consolas" w:cs="Consolas" w:eastAsia="Consolas" w:hAnsi="Consolas"/>
+                <w:color w:val="E4E7EB"/>
+                <w:sz w:val="14"/>
+                <w:szCs w:val="14"/>
+              </w:rPr>
+              <w:t xml:space="preserve">db4da88 ci: gate do trivy separado do relatorio SARIF e banco de CVE por espelho</w:t>
+            </w:r>
+          </w:p>
+          <w:p>
+            <w:pPr>
+              <w:spacing w:after="0" w:before="0" w:line="236"/>
+            </w:pPr>
+            <w:r>
+              <w:rPr>
+                <w:rFonts w:ascii="Consolas" w:cs="Consolas" w:eastAsia="Consolas" w:hAnsi="Consolas"/>
+                <w:color w:val="E4E7EB"/>
+                <w:sz w:val="14"/>
+                <w:szCs w:val="14"/>
+              </w:rPr>
+              <w:t xml:space="preserve">cb29e3e ci: DAST sobe a stack em runner limpo e nao imprime senha no log</w:t>
+            </w:r>
+          </w:p>
+          <w:p>
+            <w:pPr>
+              <w:spacing w:after="0" w:before="0" w:line="236"/>
+            </w:pPr>
+            <w:r>
+              <w:rPr>
+                <w:rFonts w:ascii="Consolas" w:cs="Consolas" w:eastAsia="Consolas" w:hAnsi="Consolas"/>
+                <w:color w:val="E4E7EB"/>
+                <w:sz w:val="14"/>
+                <w:szCs w:val="14"/>
+              </w:rPr>
+              <w:t xml:space="preserve">8452a90 docs: documento em A4 (Word + PDF) com capa, sumario e diagramas legiveis</w:t>
+            </w:r>
+          </w:p>
+          <w:p>
+            <w:pPr>
+              <w:spacing w:after="0" w:before="0" w:line="236"/>
+            </w:pPr>
+            <w:r>
+              <w:rPr>
+                <w:rFonts w:ascii="Consolas" w:cs="Consolas" w:eastAsia="Consolas" w:hAnsi="Consolas"/>
+                <w:color w:val="E4E7EB"/>
+                <w:sz w:val="14"/>
+                <w:szCs w:val="14"/>
+              </w:rPr>
+              <w:t xml:space="preserve">fb18eb9 fix(infra): tag do mosquitto que existe no docker hub (2.1.2-alpine)</w:t>
+            </w:r>
+          </w:p>
+          <w:p>
+            <w:pPr>
+              <w:spacing w:after="0" w:before="0" w:line="236"/>
+            </w:pPr>
+            <w:r>
+              <w:rPr>
+                <w:rFonts w:ascii="Consolas" w:cs="Consolas" w:eastAsia="Consolas" w:hAnsi="Consolas"/>
+                <w:color w:val="E4E7EB"/>
+                <w:sz w:val="14"/>
+                <w:szCs w:val="14"/>
+              </w:rPr>
+              <w:t xml:space="preserve">638fb66 fix(edge): headers de seguranca uma vez so na resposta (ZAP 10035 no DAST)</w:t>
             </w:r>
           </w:p>
         </w:tc>

</xml_diff>